<commit_message>
Configure real deployment URLs and fix Android INTERNET permission
Point the app at the deployed Render API by default, add the missing
INTERNET permission (required for any network access on Android), and
update the report/README with the live repo and API links.
</commit_message>
<xml_diff>
--- a/deliverables/report.docx
+++ b/deliverables/report.docx
@@ -3210,7 +3210,7 @@
           <w:szCs w:val="22"/>
           <w:rtl/>
         </w:rPr>
-        <w:t xml:space="preserve">•  إنشاء قاعدة بيانات MySQL مجانية لدى مزوّد سحابي (⟨Railway / Clever Cloud⟩) دون الحاجة لبطاقة ائتمانية.</w:t>
+        <w:t xml:space="preserve">•  إنشاء قاعدة بيانات MySQL مجانية لدى مزوّد سحابي (Clever Cloud) دون الحاجة لبطاقة ائتمانية.</w:t>
       </w:r>
     </w:p>
     <w:p>
@@ -3227,7 +3227,7 @@
           <w:szCs w:val="22"/>
           <w:rtl/>
         </w:rPr>
-        <w:t xml:space="preserve">•  الحصول على بيانات الاتصال (Host, Port, User, Password, Database name) وتخزينها في متغيرات بيئة (.env) لا تُرفع إلى المستودع البرمجي.</w:t>
+        <w:t xml:space="preserve">•  الحصول على بيانات الاتصال (Host, Port, User, Password, Database name) وتخزينها في متغيرات بيئة (.env) لا تُرفع إلى المستودع البرمجي، وتوليد Hostname/Port مباشر من لوحة تحكم المزوّد للسماح باتصال خارجي من خارج شبكته.</w:t>
       </w:r>
     </w:p>
     <w:p>
@@ -3295,7 +3295,7 @@
           <w:szCs w:val="22"/>
           <w:rtl/>
         </w:rPr>
-        <w:t xml:space="preserve">•  نشر الواجهة البرمجية (API) نفسها على منصة Render كخدمة ويب متصلة بقاعدة البيانات السحابية عبر متغيرات البيئة.</w:t>
+        <w:t xml:space="preserve">•  رفع كود المشروع إلى مستودع GitHub، ثم نشر الواجهة البرمجية (API) على منصة Render كخدمة ويب (Web Service) متصلة بمجلد backend من المستودع، مع ضبط متغيرات البيئة على لوحة تحكم Render.</w:t>
       </w:r>
     </w:p>
     <w:p>
@@ -3314,7 +3314,26 @@
           <w:szCs w:val="22"/>
           <w:rtl/>
         </w:rPr>
-        <w:t xml:space="preserve">الرابط النهائي للواجهة البرمجية بعد النشر: ⟨https://smart-clinic-api.onrender.com/api⟩</w:t>
+        <w:t xml:space="preserve">الرابط النهائي للواجهة البرمجية بعد النشر: https://smart-clinic-ci4r.onrender.com/api</w:t>
+      </w:r>
+    </w:p>
+    <w:p>
+      <w:pPr>
+        <w:bidi/>
+        <w:spacing w:after="160"/>
+        <w:jc w:val="right"/>
+      </w:pPr>
+      <w:r>
+        <w:rPr>
+          <w:rFonts w:ascii="Arial" w:cs="Arial" w:eastAsia="Arial" w:hAnsi="Arial"/>
+          <w:b w:val="false"/>
+          <w:bCs w:val="false"/>
+          <w:color w:val="000000"/>
+          <w:sz w:val="22"/>
+          <w:szCs w:val="22"/>
+          <w:rtl/>
+        </w:rPr>
+        <w:t xml:space="preserve">مستودع الكود المصدري: https://github.com/hazem-moi/smart-clinic</w:t>
       </w:r>
     </w:p>
     <w:p>
@@ -5660,7 +5679,7 @@
           <w:sz w:val="18"/>
           <w:szCs w:val="18"/>
         </w:rPr>
-        <w:t xml:space="preserve">  defaultValue: 'https://smart-clinic-api.onrender.com/api',</w:t>
+        <w:t xml:space="preserve">  defaultValue: 'https://smart-clinic-ci4r.onrender.com/api',</w:t>
       </w:r>
       <w:r>
         <w:br/>
@@ -6603,7 +6622,7 @@
           <w:sz w:val="18"/>
           <w:szCs w:val="18"/>
         </w:rPr>
-        <w:t xml:space="preserve">flutter run -d chrome --dart-define=API_URL=&lt;رابط الخادم&gt;/api</w:t>
+        <w:t xml:space="preserve">flutter run -d chrome</w:t>
       </w:r>
     </w:p>
     <w:p>
@@ -6644,7 +6663,26 @@
           <w:sz w:val="18"/>
           <w:szCs w:val="18"/>
         </w:rPr>
-        <w:t xml:space="preserve">flutter build apk --release --dart-define=API_URL=&lt;رابط الخادم&gt;/api</w:t>
+        <w:t xml:space="preserve">flutter build apk --release</w:t>
+      </w:r>
+    </w:p>
+    <w:p>
+      <w:pPr>
+        <w:bidi/>
+        <w:spacing w:after="160"/>
+        <w:jc w:val="right"/>
+      </w:pPr>
+      <w:r>
+        <w:rPr>
+          <w:rFonts w:ascii="Arial" w:cs="Arial" w:eastAsia="Arial" w:hAnsi="Arial"/>
+          <w:b w:val="false"/>
+          <w:bCs w:val="false"/>
+          <w:color w:val="000000"/>
+          <w:sz w:val="22"/>
+          <w:szCs w:val="22"/>
+          <w:rtl/>
+        </w:rPr>
+        <w:t xml:space="preserve">رابط الخادم مضبوط افتراضياً داخل الكود (lib/services/api_service.dart) على https://smart-clinic-ci4r.onrender.com/api، لذا لا حاجة لتمريره يدوياً؛ ويمكن تجاوزه عند الحاجة عبر --dart-define=API_URL=...</w:t>
       </w:r>
     </w:p>
     <w:p>

</xml_diff>

<commit_message>
Update report, README, and video script for the new features
Document the fifth table (reviews) and the doctor work-hour columns,
add a section on the added clinical/UX enhancements, and extend the
demo script to cover slot booking, cancel, dark mode, and rating.
</commit_message>
<xml_diff>
--- a/deliverables/report.docx
+++ b/deliverables/report.docx
@@ -930,7 +930,7 @@
           <w:szCs w:val="22"/>
           <w:rtl/>
         </w:rPr>
-        <w:t xml:space="preserve">تتكون قاعدة البيانات من أربعة جداول رئيسية مترابطة عبر مفاتيح خارجية (Foreign Keys)، موضحة فيما يلي:</w:t>
+        <w:t xml:space="preserve">تتكون قاعدة البيانات من خمسة جداول مترابطة عبر مفاتيح خارجية (Foreign Keys): الجداول الأربعة الأساسية (المستخدمون، التخصصات، الأطباء، المواعيد) إضافة إلى جدول التقييمات، موضحة فيما يلي:</w:t>
       </w:r>
     </w:p>
     <w:p>
@@ -1900,7 +1900,7 @@
           <w:szCs w:val="22"/>
           <w:rtl/>
         </w:rPr>
-        <w:t xml:space="preserve">يربط كل سجل طبيب بحسابه في جدول users وبتخصصه في جدول specialties.</w:t>
+        <w:t xml:space="preserve">يربط كل سجل طبيب بحسابه في جدول users وبتخصصه في جدول specialties، ويحمل أوقات دوامه.</w:t>
       </w:r>
     </w:p>
     <w:tbl>
@@ -2395,6 +2395,291 @@
           </w:p>
         </w:tc>
       </w:tr>
+      <w:tr>
+        <w:tc>
+          <w:tcPr>
+            <w:tcW w:type="dxa" w:w="2200"/>
+            <w:shd w:fill="FFFFFF" w:color="auto" w:val="clear"/>
+            <w:tcMar>
+              <w:top w:type="dxa" w:w="80"/>
+              <w:left w:type="dxa" w:w="80"/>
+              <w:bottom w:type="dxa" w:w="80"/>
+              <w:right w:type="dxa" w:w="80"/>
+            </w:tcMar>
+            <w:vAlign w:val="center"/>
+          </w:tcPr>
+          <w:p>
+            <w:pPr>
+              <w:bidi/>
+              <w:jc w:val="center"/>
+            </w:pPr>
+            <w:r>
+              <w:rPr>
+                <w:rFonts w:ascii="Arial" w:cs="Arial" w:eastAsia="Arial" w:hAnsi="Arial"/>
+                <w:b w:val="false"/>
+                <w:bCs w:val="false"/>
+                <w:color w:val="000000"/>
+                <w:sz w:val="20"/>
+                <w:szCs w:val="20"/>
+                <w:rtl/>
+              </w:rPr>
+              <w:t xml:space="preserve">work_start_hour</w:t>
+            </w:r>
+          </w:p>
+        </w:tc>
+        <w:tc>
+          <w:tcPr>
+            <w:tcW w:type="dxa" w:w="2200"/>
+            <w:shd w:fill="FFFFFF" w:color="auto" w:val="clear"/>
+            <w:tcMar>
+              <w:top w:type="dxa" w:w="80"/>
+              <w:left w:type="dxa" w:w="80"/>
+              <w:bottom w:type="dxa" w:w="80"/>
+              <w:right w:type="dxa" w:w="80"/>
+            </w:tcMar>
+            <w:vAlign w:val="center"/>
+          </w:tcPr>
+          <w:p>
+            <w:pPr>
+              <w:bidi/>
+              <w:jc w:val="center"/>
+            </w:pPr>
+            <w:r>
+              <w:rPr>
+                <w:rFonts w:ascii="Arial" w:cs="Arial" w:eastAsia="Arial" w:hAnsi="Arial"/>
+                <w:b w:val="false"/>
+                <w:bCs w:val="false"/>
+                <w:color w:val="000000"/>
+                <w:sz w:val="20"/>
+                <w:szCs w:val="20"/>
+                <w:rtl/>
+              </w:rPr>
+              <w:t xml:space="preserve">TINYINT</w:t>
+            </w:r>
+          </w:p>
+        </w:tc>
+        <w:tc>
+          <w:tcPr>
+            <w:tcW w:type="dxa" w:w="4500"/>
+            <w:shd w:fill="FFFFFF" w:color="auto" w:val="clear"/>
+            <w:tcMar>
+              <w:top w:type="dxa" w:w="80"/>
+              <w:left w:type="dxa" w:w="80"/>
+              <w:bottom w:type="dxa" w:w="80"/>
+              <w:right w:type="dxa" w:w="80"/>
+            </w:tcMar>
+            <w:vAlign w:val="center"/>
+          </w:tcPr>
+          <w:p>
+            <w:pPr>
+              <w:bidi/>
+              <w:jc w:val="center"/>
+            </w:pPr>
+            <w:r>
+              <w:rPr>
+                <w:rFonts w:ascii="Arial" w:cs="Arial" w:eastAsia="Arial" w:hAnsi="Arial"/>
+                <w:b w:val="false"/>
+                <w:bCs w:val="false"/>
+                <w:color w:val="000000"/>
+                <w:sz w:val="20"/>
+                <w:szCs w:val="20"/>
+                <w:rtl/>
+              </w:rPr>
+              <w:t xml:space="preserve">ساعة بداية الدوام (لتوليد الخانات)</w:t>
+            </w:r>
+          </w:p>
+        </w:tc>
+      </w:tr>
+      <w:tr>
+        <w:tc>
+          <w:tcPr>
+            <w:tcW w:type="dxa" w:w="2200"/>
+            <w:shd w:fill="FFFFFF" w:color="auto" w:val="clear"/>
+            <w:tcMar>
+              <w:top w:type="dxa" w:w="80"/>
+              <w:left w:type="dxa" w:w="80"/>
+              <w:bottom w:type="dxa" w:w="80"/>
+              <w:right w:type="dxa" w:w="80"/>
+            </w:tcMar>
+            <w:vAlign w:val="center"/>
+          </w:tcPr>
+          <w:p>
+            <w:pPr>
+              <w:bidi/>
+              <w:jc w:val="center"/>
+            </w:pPr>
+            <w:r>
+              <w:rPr>
+                <w:rFonts w:ascii="Arial" w:cs="Arial" w:eastAsia="Arial" w:hAnsi="Arial"/>
+                <w:b w:val="false"/>
+                <w:bCs w:val="false"/>
+                <w:color w:val="000000"/>
+                <w:sz w:val="20"/>
+                <w:szCs w:val="20"/>
+                <w:rtl/>
+              </w:rPr>
+              <w:t xml:space="preserve">work_end_hour</w:t>
+            </w:r>
+          </w:p>
+        </w:tc>
+        <w:tc>
+          <w:tcPr>
+            <w:tcW w:type="dxa" w:w="2200"/>
+            <w:shd w:fill="FFFFFF" w:color="auto" w:val="clear"/>
+            <w:tcMar>
+              <w:top w:type="dxa" w:w="80"/>
+              <w:left w:type="dxa" w:w="80"/>
+              <w:bottom w:type="dxa" w:w="80"/>
+              <w:right w:type="dxa" w:w="80"/>
+            </w:tcMar>
+            <w:vAlign w:val="center"/>
+          </w:tcPr>
+          <w:p>
+            <w:pPr>
+              <w:bidi/>
+              <w:jc w:val="center"/>
+            </w:pPr>
+            <w:r>
+              <w:rPr>
+                <w:rFonts w:ascii="Arial" w:cs="Arial" w:eastAsia="Arial" w:hAnsi="Arial"/>
+                <w:b w:val="false"/>
+                <w:bCs w:val="false"/>
+                <w:color w:val="000000"/>
+                <w:sz w:val="20"/>
+                <w:szCs w:val="20"/>
+                <w:rtl/>
+              </w:rPr>
+              <w:t xml:space="preserve">TINYINT</w:t>
+            </w:r>
+          </w:p>
+        </w:tc>
+        <w:tc>
+          <w:tcPr>
+            <w:tcW w:type="dxa" w:w="4500"/>
+            <w:shd w:fill="FFFFFF" w:color="auto" w:val="clear"/>
+            <w:tcMar>
+              <w:top w:type="dxa" w:w="80"/>
+              <w:left w:type="dxa" w:w="80"/>
+              <w:bottom w:type="dxa" w:w="80"/>
+              <w:right w:type="dxa" w:w="80"/>
+            </w:tcMar>
+            <w:vAlign w:val="center"/>
+          </w:tcPr>
+          <w:p>
+            <w:pPr>
+              <w:bidi/>
+              <w:jc w:val="center"/>
+            </w:pPr>
+            <w:r>
+              <w:rPr>
+                <w:rFonts w:ascii="Arial" w:cs="Arial" w:eastAsia="Arial" w:hAnsi="Arial"/>
+                <w:b w:val="false"/>
+                <w:bCs w:val="false"/>
+                <w:color w:val="000000"/>
+                <w:sz w:val="20"/>
+                <w:szCs w:val="20"/>
+                <w:rtl/>
+              </w:rPr>
+              <w:t xml:space="preserve">ساعة نهاية الدوام</w:t>
+            </w:r>
+          </w:p>
+        </w:tc>
+      </w:tr>
+      <w:tr>
+        <w:tc>
+          <w:tcPr>
+            <w:tcW w:type="dxa" w:w="2200"/>
+            <w:shd w:fill="FFFFFF" w:color="auto" w:val="clear"/>
+            <w:tcMar>
+              <w:top w:type="dxa" w:w="80"/>
+              <w:left w:type="dxa" w:w="80"/>
+              <w:bottom w:type="dxa" w:w="80"/>
+              <w:right w:type="dxa" w:w="80"/>
+            </w:tcMar>
+            <w:vAlign w:val="center"/>
+          </w:tcPr>
+          <w:p>
+            <w:pPr>
+              <w:bidi/>
+              <w:jc w:val="center"/>
+            </w:pPr>
+            <w:r>
+              <w:rPr>
+                <w:rFonts w:ascii="Arial" w:cs="Arial" w:eastAsia="Arial" w:hAnsi="Arial"/>
+                <w:b w:val="false"/>
+                <w:bCs w:val="false"/>
+                <w:color w:val="000000"/>
+                <w:sz w:val="20"/>
+                <w:szCs w:val="20"/>
+                <w:rtl/>
+              </w:rPr>
+              <w:t xml:space="preserve">slot_minutes</w:t>
+            </w:r>
+          </w:p>
+        </w:tc>
+        <w:tc>
+          <w:tcPr>
+            <w:tcW w:type="dxa" w:w="2200"/>
+            <w:shd w:fill="FFFFFF" w:color="auto" w:val="clear"/>
+            <w:tcMar>
+              <w:top w:type="dxa" w:w="80"/>
+              <w:left w:type="dxa" w:w="80"/>
+              <w:bottom w:type="dxa" w:w="80"/>
+              <w:right w:type="dxa" w:w="80"/>
+            </w:tcMar>
+            <w:vAlign w:val="center"/>
+          </w:tcPr>
+          <w:p>
+            <w:pPr>
+              <w:bidi/>
+              <w:jc w:val="center"/>
+            </w:pPr>
+            <w:r>
+              <w:rPr>
+                <w:rFonts w:ascii="Arial" w:cs="Arial" w:eastAsia="Arial" w:hAnsi="Arial"/>
+                <w:b w:val="false"/>
+                <w:bCs w:val="false"/>
+                <w:color w:val="000000"/>
+                <w:sz w:val="20"/>
+                <w:szCs w:val="20"/>
+                <w:rtl/>
+              </w:rPr>
+              <w:t xml:space="preserve">INT</w:t>
+            </w:r>
+          </w:p>
+        </w:tc>
+        <w:tc>
+          <w:tcPr>
+            <w:tcW w:type="dxa" w:w="4500"/>
+            <w:shd w:fill="FFFFFF" w:color="auto" w:val="clear"/>
+            <w:tcMar>
+              <w:top w:type="dxa" w:w="80"/>
+              <w:left w:type="dxa" w:w="80"/>
+              <w:bottom w:type="dxa" w:w="80"/>
+              <w:right w:type="dxa" w:w="80"/>
+            </w:tcMar>
+            <w:vAlign w:val="center"/>
+          </w:tcPr>
+          <w:p>
+            <w:pPr>
+              <w:bidi/>
+              <w:jc w:val="center"/>
+            </w:pPr>
+            <w:r>
+              <w:rPr>
+                <w:rFonts w:ascii="Arial" w:cs="Arial" w:eastAsia="Arial" w:hAnsi="Arial"/>
+                <w:b w:val="false"/>
+                <w:bCs w:val="false"/>
+                <w:color w:val="000000"/>
+                <w:sz w:val="20"/>
+                <w:szCs w:val="20"/>
+                <w:rtl/>
+              </w:rPr>
+              <w:t xml:space="preserve">مدة الخانة الزمنية بالدقائق</w:t>
+            </w:r>
+          </w:p>
+        </w:tc>
+      </w:tr>
     </w:tbl>
     <w:p>
       <w:pPr>
@@ -3140,6 +3425,728 @@
     </w:p>
     <w:p>
       <w:pPr>
+        <w:pStyle w:val="Heading2"/>
+        <w:bidi/>
+        <w:spacing w:after="140" w:before="240"/>
+        <w:jc w:val="right"/>
+      </w:pPr>
+      <w:r>
+        <w:rPr>
+          <w:rFonts w:ascii="Arial" w:cs="Arial" w:eastAsia="Arial" w:hAnsi="Arial"/>
+          <w:b/>
+          <w:bCs/>
+          <w:color w:val="000000"/>
+          <w:sz w:val="26"/>
+          <w:szCs w:val="26"/>
+          <w:rtl/>
+        </w:rPr>
+        <w:t xml:space="preserve">2.5 جدول التقييمات (reviews)</w:t>
+      </w:r>
+    </w:p>
+    <w:p>
+      <w:pPr>
+        <w:bidi/>
+        <w:spacing w:after="160"/>
+        <w:jc w:val="right"/>
+      </w:pPr>
+      <w:r>
+        <w:rPr>
+          <w:rFonts w:ascii="Arial" w:cs="Arial" w:eastAsia="Arial" w:hAnsi="Arial"/>
+          <w:b w:val="false"/>
+          <w:bCs w:val="false"/>
+          <w:color w:val="000000"/>
+          <w:sz w:val="22"/>
+          <w:szCs w:val="22"/>
+          <w:rtl/>
+        </w:rPr>
+        <w:t xml:space="preserve">يخزّن تقييم المريض للطبيب بعد إتمام الفحص، بقيد تفرّد على الموعد يضمن تقييماً واحداً لكل موعد.</w:t>
+      </w:r>
+    </w:p>
+    <w:tbl>
+      <w:tblPr>
+        <w:tblW w:type="dxa" w:w="8900"/>
+        <w:tblBorders>
+          <w:top w:val="single" w:color="000000" w:sz="2"/>
+          <w:left w:val="single" w:color="000000" w:sz="2"/>
+          <w:bottom w:val="single" w:color="000000" w:sz="2"/>
+          <w:right w:val="single" w:color="000000" w:sz="2"/>
+          <w:insideH w:val="single" w:color="auto" w:sz="4"/>
+          <w:insideV w:val="single" w:color="auto" w:sz="4"/>
+        </w:tblBorders>
+      </w:tblPr>
+      <w:tblGrid>
+        <w:gridCol w:w="2200"/>
+        <w:gridCol w:w="2200"/>
+        <w:gridCol w:w="4500"/>
+      </w:tblGrid>
+      <w:tr>
+        <w:tc>
+          <w:tcPr>
+            <w:tcW w:type="dxa" w:w="2200"/>
+            <w:shd w:fill="FFFFFF" w:color="auto" w:val="clear"/>
+            <w:tcMar>
+              <w:top w:type="dxa" w:w="80"/>
+              <w:left w:type="dxa" w:w="80"/>
+              <w:bottom w:type="dxa" w:w="80"/>
+              <w:right w:type="dxa" w:w="80"/>
+            </w:tcMar>
+            <w:vAlign w:val="center"/>
+          </w:tcPr>
+          <w:p>
+            <w:pPr>
+              <w:bidi/>
+              <w:jc w:val="center"/>
+            </w:pPr>
+            <w:r>
+              <w:rPr>
+                <w:rFonts w:ascii="Arial" w:cs="Arial" w:eastAsia="Arial" w:hAnsi="Arial"/>
+                <w:b/>
+                <w:bCs/>
+                <w:color w:val="000000"/>
+                <w:sz w:val="20"/>
+                <w:szCs w:val="20"/>
+                <w:rtl/>
+              </w:rPr>
+              <w:t xml:space="preserve">الحقل</w:t>
+            </w:r>
+          </w:p>
+        </w:tc>
+        <w:tc>
+          <w:tcPr>
+            <w:tcW w:type="dxa" w:w="2200"/>
+            <w:shd w:fill="FFFFFF" w:color="auto" w:val="clear"/>
+            <w:tcMar>
+              <w:top w:type="dxa" w:w="80"/>
+              <w:left w:type="dxa" w:w="80"/>
+              <w:bottom w:type="dxa" w:w="80"/>
+              <w:right w:type="dxa" w:w="80"/>
+            </w:tcMar>
+            <w:vAlign w:val="center"/>
+          </w:tcPr>
+          <w:p>
+            <w:pPr>
+              <w:bidi/>
+              <w:jc w:val="center"/>
+            </w:pPr>
+            <w:r>
+              <w:rPr>
+                <w:rFonts w:ascii="Arial" w:cs="Arial" w:eastAsia="Arial" w:hAnsi="Arial"/>
+                <w:b/>
+                <w:bCs/>
+                <w:color w:val="000000"/>
+                <w:sz w:val="20"/>
+                <w:szCs w:val="20"/>
+                <w:rtl/>
+              </w:rPr>
+              <w:t xml:space="preserve">النوع</w:t>
+            </w:r>
+          </w:p>
+        </w:tc>
+        <w:tc>
+          <w:tcPr>
+            <w:tcW w:type="dxa" w:w="4500"/>
+            <w:shd w:fill="FFFFFF" w:color="auto" w:val="clear"/>
+            <w:tcMar>
+              <w:top w:type="dxa" w:w="80"/>
+              <w:left w:type="dxa" w:w="80"/>
+              <w:bottom w:type="dxa" w:w="80"/>
+              <w:right w:type="dxa" w:w="80"/>
+            </w:tcMar>
+            <w:vAlign w:val="center"/>
+          </w:tcPr>
+          <w:p>
+            <w:pPr>
+              <w:bidi/>
+              <w:jc w:val="center"/>
+            </w:pPr>
+            <w:r>
+              <w:rPr>
+                <w:rFonts w:ascii="Arial" w:cs="Arial" w:eastAsia="Arial" w:hAnsi="Arial"/>
+                <w:b/>
+                <w:bCs/>
+                <w:color w:val="000000"/>
+                <w:sz w:val="20"/>
+                <w:szCs w:val="20"/>
+                <w:rtl/>
+              </w:rPr>
+              <w:t xml:space="preserve">الوصف</w:t>
+            </w:r>
+          </w:p>
+        </w:tc>
+      </w:tr>
+      <w:tr>
+        <w:tc>
+          <w:tcPr>
+            <w:tcW w:type="dxa" w:w="2200"/>
+            <w:shd w:fill="FFFFFF" w:color="auto" w:val="clear"/>
+            <w:tcMar>
+              <w:top w:type="dxa" w:w="80"/>
+              <w:left w:type="dxa" w:w="80"/>
+              <w:bottom w:type="dxa" w:w="80"/>
+              <w:right w:type="dxa" w:w="80"/>
+            </w:tcMar>
+            <w:vAlign w:val="center"/>
+          </w:tcPr>
+          <w:p>
+            <w:pPr>
+              <w:bidi/>
+              <w:jc w:val="center"/>
+            </w:pPr>
+            <w:r>
+              <w:rPr>
+                <w:rFonts w:ascii="Arial" w:cs="Arial" w:eastAsia="Arial" w:hAnsi="Arial"/>
+                <w:b w:val="false"/>
+                <w:bCs w:val="false"/>
+                <w:color w:val="000000"/>
+                <w:sz w:val="20"/>
+                <w:szCs w:val="20"/>
+                <w:rtl/>
+              </w:rPr>
+              <w:t xml:space="preserve">id</w:t>
+            </w:r>
+          </w:p>
+        </w:tc>
+        <w:tc>
+          <w:tcPr>
+            <w:tcW w:type="dxa" w:w="2200"/>
+            <w:shd w:fill="FFFFFF" w:color="auto" w:val="clear"/>
+            <w:tcMar>
+              <w:top w:type="dxa" w:w="80"/>
+              <w:left w:type="dxa" w:w="80"/>
+              <w:bottom w:type="dxa" w:w="80"/>
+              <w:right w:type="dxa" w:w="80"/>
+            </w:tcMar>
+            <w:vAlign w:val="center"/>
+          </w:tcPr>
+          <w:p>
+            <w:pPr>
+              <w:bidi/>
+              <w:jc w:val="center"/>
+            </w:pPr>
+            <w:r>
+              <w:rPr>
+                <w:rFonts w:ascii="Arial" w:cs="Arial" w:eastAsia="Arial" w:hAnsi="Arial"/>
+                <w:b w:val="false"/>
+                <w:bCs w:val="false"/>
+                <w:color w:val="000000"/>
+                <w:sz w:val="20"/>
+                <w:szCs w:val="20"/>
+                <w:rtl/>
+              </w:rPr>
+              <w:t xml:space="preserve">INT (PK, AUTO_INCREMENT)</w:t>
+            </w:r>
+          </w:p>
+        </w:tc>
+        <w:tc>
+          <w:tcPr>
+            <w:tcW w:type="dxa" w:w="4500"/>
+            <w:shd w:fill="FFFFFF" w:color="auto" w:val="clear"/>
+            <w:tcMar>
+              <w:top w:type="dxa" w:w="80"/>
+              <w:left w:type="dxa" w:w="80"/>
+              <w:bottom w:type="dxa" w:w="80"/>
+              <w:right w:type="dxa" w:w="80"/>
+            </w:tcMar>
+            <w:vAlign w:val="center"/>
+          </w:tcPr>
+          <w:p>
+            <w:pPr>
+              <w:bidi/>
+              <w:jc w:val="center"/>
+            </w:pPr>
+            <w:r>
+              <w:rPr>
+                <w:rFonts w:ascii="Arial" w:cs="Arial" w:eastAsia="Arial" w:hAnsi="Arial"/>
+                <w:b w:val="false"/>
+                <w:bCs w:val="false"/>
+                <w:color w:val="000000"/>
+                <w:sz w:val="20"/>
+                <w:szCs w:val="20"/>
+                <w:rtl/>
+              </w:rPr>
+              <w:t xml:space="preserve">المعرّف الفريد للتقييم</w:t>
+            </w:r>
+          </w:p>
+        </w:tc>
+      </w:tr>
+      <w:tr>
+        <w:tc>
+          <w:tcPr>
+            <w:tcW w:type="dxa" w:w="2200"/>
+            <w:shd w:fill="FFFFFF" w:color="auto" w:val="clear"/>
+            <w:tcMar>
+              <w:top w:type="dxa" w:w="80"/>
+              <w:left w:type="dxa" w:w="80"/>
+              <w:bottom w:type="dxa" w:w="80"/>
+              <w:right w:type="dxa" w:w="80"/>
+            </w:tcMar>
+            <w:vAlign w:val="center"/>
+          </w:tcPr>
+          <w:p>
+            <w:pPr>
+              <w:bidi/>
+              <w:jc w:val="center"/>
+            </w:pPr>
+            <w:r>
+              <w:rPr>
+                <w:rFonts w:ascii="Arial" w:cs="Arial" w:eastAsia="Arial" w:hAnsi="Arial"/>
+                <w:b w:val="false"/>
+                <w:bCs w:val="false"/>
+                <w:color w:val="000000"/>
+                <w:sz w:val="20"/>
+                <w:szCs w:val="20"/>
+                <w:rtl/>
+              </w:rPr>
+              <w:t xml:space="preserve">appointment_id</w:t>
+            </w:r>
+          </w:p>
+        </w:tc>
+        <w:tc>
+          <w:tcPr>
+            <w:tcW w:type="dxa" w:w="2200"/>
+            <w:shd w:fill="FFFFFF" w:color="auto" w:val="clear"/>
+            <w:tcMar>
+              <w:top w:type="dxa" w:w="80"/>
+              <w:left w:type="dxa" w:w="80"/>
+              <w:bottom w:type="dxa" w:w="80"/>
+              <w:right w:type="dxa" w:w="80"/>
+            </w:tcMar>
+            <w:vAlign w:val="center"/>
+          </w:tcPr>
+          <w:p>
+            <w:pPr>
+              <w:bidi/>
+              <w:jc w:val="center"/>
+            </w:pPr>
+            <w:r>
+              <w:rPr>
+                <w:rFonts w:ascii="Arial" w:cs="Arial" w:eastAsia="Arial" w:hAnsi="Arial"/>
+                <w:b w:val="false"/>
+                <w:bCs w:val="false"/>
+                <w:color w:val="000000"/>
+                <w:sz w:val="20"/>
+                <w:szCs w:val="20"/>
+                <w:rtl/>
+              </w:rPr>
+              <w:t xml:space="preserve">INT (FK, UNIQUE)</w:t>
+            </w:r>
+          </w:p>
+        </w:tc>
+        <w:tc>
+          <w:tcPr>
+            <w:tcW w:type="dxa" w:w="4500"/>
+            <w:shd w:fill="FFFFFF" w:color="auto" w:val="clear"/>
+            <w:tcMar>
+              <w:top w:type="dxa" w:w="80"/>
+              <w:left w:type="dxa" w:w="80"/>
+              <w:bottom w:type="dxa" w:w="80"/>
+              <w:right w:type="dxa" w:w="80"/>
+            </w:tcMar>
+            <w:vAlign w:val="center"/>
+          </w:tcPr>
+          <w:p>
+            <w:pPr>
+              <w:bidi/>
+              <w:jc w:val="center"/>
+            </w:pPr>
+            <w:r>
+              <w:rPr>
+                <w:rFonts w:ascii="Arial" w:cs="Arial" w:eastAsia="Arial" w:hAnsi="Arial"/>
+                <w:b w:val="false"/>
+                <w:bCs w:val="false"/>
+                <w:color w:val="000000"/>
+                <w:sz w:val="20"/>
+                <w:szCs w:val="20"/>
+                <w:rtl/>
+              </w:rPr>
+              <w:t xml:space="preserve">الموعد المُقيَّم (تقييم واحد لكل موعد)</w:t>
+            </w:r>
+          </w:p>
+        </w:tc>
+      </w:tr>
+      <w:tr>
+        <w:tc>
+          <w:tcPr>
+            <w:tcW w:type="dxa" w:w="2200"/>
+            <w:shd w:fill="FFFFFF" w:color="auto" w:val="clear"/>
+            <w:tcMar>
+              <w:top w:type="dxa" w:w="80"/>
+              <w:left w:type="dxa" w:w="80"/>
+              <w:bottom w:type="dxa" w:w="80"/>
+              <w:right w:type="dxa" w:w="80"/>
+            </w:tcMar>
+            <w:vAlign w:val="center"/>
+          </w:tcPr>
+          <w:p>
+            <w:pPr>
+              <w:bidi/>
+              <w:jc w:val="center"/>
+            </w:pPr>
+            <w:r>
+              <w:rPr>
+                <w:rFonts w:ascii="Arial" w:cs="Arial" w:eastAsia="Arial" w:hAnsi="Arial"/>
+                <w:b w:val="false"/>
+                <w:bCs w:val="false"/>
+                <w:color w:val="000000"/>
+                <w:sz w:val="20"/>
+                <w:szCs w:val="20"/>
+                <w:rtl/>
+              </w:rPr>
+              <w:t xml:space="preserve">patient_id</w:t>
+            </w:r>
+          </w:p>
+        </w:tc>
+        <w:tc>
+          <w:tcPr>
+            <w:tcW w:type="dxa" w:w="2200"/>
+            <w:shd w:fill="FFFFFF" w:color="auto" w:val="clear"/>
+            <w:tcMar>
+              <w:top w:type="dxa" w:w="80"/>
+              <w:left w:type="dxa" w:w="80"/>
+              <w:bottom w:type="dxa" w:w="80"/>
+              <w:right w:type="dxa" w:w="80"/>
+            </w:tcMar>
+            <w:vAlign w:val="center"/>
+          </w:tcPr>
+          <w:p>
+            <w:pPr>
+              <w:bidi/>
+              <w:jc w:val="center"/>
+            </w:pPr>
+            <w:r>
+              <w:rPr>
+                <w:rFonts w:ascii="Arial" w:cs="Arial" w:eastAsia="Arial" w:hAnsi="Arial"/>
+                <w:b w:val="false"/>
+                <w:bCs w:val="false"/>
+                <w:color w:val="000000"/>
+                <w:sz w:val="20"/>
+                <w:szCs w:val="20"/>
+                <w:rtl/>
+              </w:rPr>
+              <w:t xml:space="preserve">INT (FK → users.id)</w:t>
+            </w:r>
+          </w:p>
+        </w:tc>
+        <w:tc>
+          <w:tcPr>
+            <w:tcW w:type="dxa" w:w="4500"/>
+            <w:shd w:fill="FFFFFF" w:color="auto" w:val="clear"/>
+            <w:tcMar>
+              <w:top w:type="dxa" w:w="80"/>
+              <w:left w:type="dxa" w:w="80"/>
+              <w:bottom w:type="dxa" w:w="80"/>
+              <w:right w:type="dxa" w:w="80"/>
+            </w:tcMar>
+            <w:vAlign w:val="center"/>
+          </w:tcPr>
+          <w:p>
+            <w:pPr>
+              <w:bidi/>
+              <w:jc w:val="center"/>
+            </w:pPr>
+            <w:r>
+              <w:rPr>
+                <w:rFonts w:ascii="Arial" w:cs="Arial" w:eastAsia="Arial" w:hAnsi="Arial"/>
+                <w:b w:val="false"/>
+                <w:bCs w:val="false"/>
+                <w:color w:val="000000"/>
+                <w:sz w:val="20"/>
+                <w:szCs w:val="20"/>
+                <w:rtl/>
+              </w:rPr>
+              <w:t xml:space="preserve">المريض صاحب التقييم</w:t>
+            </w:r>
+          </w:p>
+        </w:tc>
+      </w:tr>
+      <w:tr>
+        <w:tc>
+          <w:tcPr>
+            <w:tcW w:type="dxa" w:w="2200"/>
+            <w:shd w:fill="FFFFFF" w:color="auto" w:val="clear"/>
+            <w:tcMar>
+              <w:top w:type="dxa" w:w="80"/>
+              <w:left w:type="dxa" w:w="80"/>
+              <w:bottom w:type="dxa" w:w="80"/>
+              <w:right w:type="dxa" w:w="80"/>
+            </w:tcMar>
+            <w:vAlign w:val="center"/>
+          </w:tcPr>
+          <w:p>
+            <w:pPr>
+              <w:bidi/>
+              <w:jc w:val="center"/>
+            </w:pPr>
+            <w:r>
+              <w:rPr>
+                <w:rFonts w:ascii="Arial" w:cs="Arial" w:eastAsia="Arial" w:hAnsi="Arial"/>
+                <w:b w:val="false"/>
+                <w:bCs w:val="false"/>
+                <w:color w:val="000000"/>
+                <w:sz w:val="20"/>
+                <w:szCs w:val="20"/>
+                <w:rtl/>
+              </w:rPr>
+              <w:t xml:space="preserve">doctor_id</w:t>
+            </w:r>
+          </w:p>
+        </w:tc>
+        <w:tc>
+          <w:tcPr>
+            <w:tcW w:type="dxa" w:w="2200"/>
+            <w:shd w:fill="FFFFFF" w:color="auto" w:val="clear"/>
+            <w:tcMar>
+              <w:top w:type="dxa" w:w="80"/>
+              <w:left w:type="dxa" w:w="80"/>
+              <w:bottom w:type="dxa" w:w="80"/>
+              <w:right w:type="dxa" w:w="80"/>
+            </w:tcMar>
+            <w:vAlign w:val="center"/>
+          </w:tcPr>
+          <w:p>
+            <w:pPr>
+              <w:bidi/>
+              <w:jc w:val="center"/>
+            </w:pPr>
+            <w:r>
+              <w:rPr>
+                <w:rFonts w:ascii="Arial" w:cs="Arial" w:eastAsia="Arial" w:hAnsi="Arial"/>
+                <w:b w:val="false"/>
+                <w:bCs w:val="false"/>
+                <w:color w:val="000000"/>
+                <w:sz w:val="20"/>
+                <w:szCs w:val="20"/>
+                <w:rtl/>
+              </w:rPr>
+              <w:t xml:space="preserve">INT (FK → doctors.id)</w:t>
+            </w:r>
+          </w:p>
+        </w:tc>
+        <w:tc>
+          <w:tcPr>
+            <w:tcW w:type="dxa" w:w="4500"/>
+            <w:shd w:fill="FFFFFF" w:color="auto" w:val="clear"/>
+            <w:tcMar>
+              <w:top w:type="dxa" w:w="80"/>
+              <w:left w:type="dxa" w:w="80"/>
+              <w:bottom w:type="dxa" w:w="80"/>
+              <w:right w:type="dxa" w:w="80"/>
+            </w:tcMar>
+            <w:vAlign w:val="center"/>
+          </w:tcPr>
+          <w:p>
+            <w:pPr>
+              <w:bidi/>
+              <w:jc w:val="center"/>
+            </w:pPr>
+            <w:r>
+              <w:rPr>
+                <w:rFonts w:ascii="Arial" w:cs="Arial" w:eastAsia="Arial" w:hAnsi="Arial"/>
+                <w:b w:val="false"/>
+                <w:bCs w:val="false"/>
+                <w:color w:val="000000"/>
+                <w:sz w:val="20"/>
+                <w:szCs w:val="20"/>
+                <w:rtl/>
+              </w:rPr>
+              <w:t xml:space="preserve">الطبيب المُقيَّم</w:t>
+            </w:r>
+          </w:p>
+        </w:tc>
+      </w:tr>
+      <w:tr>
+        <w:tc>
+          <w:tcPr>
+            <w:tcW w:type="dxa" w:w="2200"/>
+            <w:shd w:fill="FFFFFF" w:color="auto" w:val="clear"/>
+            <w:tcMar>
+              <w:top w:type="dxa" w:w="80"/>
+              <w:left w:type="dxa" w:w="80"/>
+              <w:bottom w:type="dxa" w:w="80"/>
+              <w:right w:type="dxa" w:w="80"/>
+            </w:tcMar>
+            <w:vAlign w:val="center"/>
+          </w:tcPr>
+          <w:p>
+            <w:pPr>
+              <w:bidi/>
+              <w:jc w:val="center"/>
+            </w:pPr>
+            <w:r>
+              <w:rPr>
+                <w:rFonts w:ascii="Arial" w:cs="Arial" w:eastAsia="Arial" w:hAnsi="Arial"/>
+                <w:b w:val="false"/>
+                <w:bCs w:val="false"/>
+                <w:color w:val="000000"/>
+                <w:sz w:val="20"/>
+                <w:szCs w:val="20"/>
+                <w:rtl/>
+              </w:rPr>
+              <w:t xml:space="preserve">rating</w:t>
+            </w:r>
+          </w:p>
+        </w:tc>
+        <w:tc>
+          <w:tcPr>
+            <w:tcW w:type="dxa" w:w="2200"/>
+            <w:shd w:fill="FFFFFF" w:color="auto" w:val="clear"/>
+            <w:tcMar>
+              <w:top w:type="dxa" w:w="80"/>
+              <w:left w:type="dxa" w:w="80"/>
+              <w:bottom w:type="dxa" w:w="80"/>
+              <w:right w:type="dxa" w:w="80"/>
+            </w:tcMar>
+            <w:vAlign w:val="center"/>
+          </w:tcPr>
+          <w:p>
+            <w:pPr>
+              <w:bidi/>
+              <w:jc w:val="center"/>
+            </w:pPr>
+            <w:r>
+              <w:rPr>
+                <w:rFonts w:ascii="Arial" w:cs="Arial" w:eastAsia="Arial" w:hAnsi="Arial"/>
+                <w:b w:val="false"/>
+                <w:bCs w:val="false"/>
+                <w:color w:val="000000"/>
+                <w:sz w:val="20"/>
+                <w:szCs w:val="20"/>
+                <w:rtl/>
+              </w:rPr>
+              <w:t xml:space="preserve">TINYINT</w:t>
+            </w:r>
+          </w:p>
+        </w:tc>
+        <w:tc>
+          <w:tcPr>
+            <w:tcW w:type="dxa" w:w="4500"/>
+            <w:shd w:fill="FFFFFF" w:color="auto" w:val="clear"/>
+            <w:tcMar>
+              <w:top w:type="dxa" w:w="80"/>
+              <w:left w:type="dxa" w:w="80"/>
+              <w:bottom w:type="dxa" w:w="80"/>
+              <w:right w:type="dxa" w:w="80"/>
+            </w:tcMar>
+            <w:vAlign w:val="center"/>
+          </w:tcPr>
+          <w:p>
+            <w:pPr>
+              <w:bidi/>
+              <w:jc w:val="center"/>
+            </w:pPr>
+            <w:r>
+              <w:rPr>
+                <w:rFonts w:ascii="Arial" w:cs="Arial" w:eastAsia="Arial" w:hAnsi="Arial"/>
+                <w:b w:val="false"/>
+                <w:bCs w:val="false"/>
+                <w:color w:val="000000"/>
+                <w:sz w:val="20"/>
+                <w:szCs w:val="20"/>
+                <w:rtl/>
+              </w:rPr>
+              <w:t xml:space="preserve">التقييم من 1 إلى 5</w:t>
+            </w:r>
+          </w:p>
+        </w:tc>
+      </w:tr>
+      <w:tr>
+        <w:tc>
+          <w:tcPr>
+            <w:tcW w:type="dxa" w:w="2200"/>
+            <w:shd w:fill="FFFFFF" w:color="auto" w:val="clear"/>
+            <w:tcMar>
+              <w:top w:type="dxa" w:w="80"/>
+              <w:left w:type="dxa" w:w="80"/>
+              <w:bottom w:type="dxa" w:w="80"/>
+              <w:right w:type="dxa" w:w="80"/>
+            </w:tcMar>
+            <w:vAlign w:val="center"/>
+          </w:tcPr>
+          <w:p>
+            <w:pPr>
+              <w:bidi/>
+              <w:jc w:val="center"/>
+            </w:pPr>
+            <w:r>
+              <w:rPr>
+                <w:rFonts w:ascii="Arial" w:cs="Arial" w:eastAsia="Arial" w:hAnsi="Arial"/>
+                <w:b w:val="false"/>
+                <w:bCs w:val="false"/>
+                <w:color w:val="000000"/>
+                <w:sz w:val="20"/>
+                <w:szCs w:val="20"/>
+                <w:rtl/>
+              </w:rPr>
+              <w:t xml:space="preserve">comment</w:t>
+            </w:r>
+          </w:p>
+        </w:tc>
+        <w:tc>
+          <w:tcPr>
+            <w:tcW w:type="dxa" w:w="2200"/>
+            <w:shd w:fill="FFFFFF" w:color="auto" w:val="clear"/>
+            <w:tcMar>
+              <w:top w:type="dxa" w:w="80"/>
+              <w:left w:type="dxa" w:w="80"/>
+              <w:bottom w:type="dxa" w:w="80"/>
+              <w:right w:type="dxa" w:w="80"/>
+            </w:tcMar>
+            <w:vAlign w:val="center"/>
+          </w:tcPr>
+          <w:p>
+            <w:pPr>
+              <w:bidi/>
+              <w:jc w:val="center"/>
+            </w:pPr>
+            <w:r>
+              <w:rPr>
+                <w:rFonts w:ascii="Arial" w:cs="Arial" w:eastAsia="Arial" w:hAnsi="Arial"/>
+                <w:b w:val="false"/>
+                <w:bCs w:val="false"/>
+                <w:color w:val="000000"/>
+                <w:sz w:val="20"/>
+                <w:szCs w:val="20"/>
+                <w:rtl/>
+              </w:rPr>
+              <w:t xml:space="preserve">TEXT (NULL)</w:t>
+            </w:r>
+          </w:p>
+        </w:tc>
+        <w:tc>
+          <w:tcPr>
+            <w:tcW w:type="dxa" w:w="4500"/>
+            <w:shd w:fill="FFFFFF" w:color="auto" w:val="clear"/>
+            <w:tcMar>
+              <w:top w:type="dxa" w:w="80"/>
+              <w:left w:type="dxa" w:w="80"/>
+              <w:bottom w:type="dxa" w:w="80"/>
+              <w:right w:type="dxa" w:w="80"/>
+            </w:tcMar>
+            <w:vAlign w:val="center"/>
+          </w:tcPr>
+          <w:p>
+            <w:pPr>
+              <w:bidi/>
+              <w:jc w:val="center"/>
+            </w:pPr>
+            <w:r>
+              <w:rPr>
+                <w:rFonts w:ascii="Arial" w:cs="Arial" w:eastAsia="Arial" w:hAnsi="Arial"/>
+                <w:b w:val="false"/>
+                <w:bCs w:val="false"/>
+                <w:color w:val="000000"/>
+                <w:sz w:val="20"/>
+                <w:szCs w:val="20"/>
+                <w:rtl/>
+              </w:rPr>
+              <w:t xml:space="preserve">تعليق اختياري</w:t>
+            </w:r>
+          </w:p>
+        </w:tc>
+      </w:tr>
+    </w:tbl>
+    <w:p>
+      <w:pPr>
         <w:pStyle w:val="Heading1"/>
         <w:bidi/>
         <w:spacing w:after="160" w:before="320"/>
@@ -6845,7 +7852,7 @@
           <w:szCs w:val="30"/>
           <w:rtl/>
         </w:rPr>
-        <w:t xml:space="preserve">10. الخاتمة</w:t>
+        <w:t xml:space="preserve">10. التطويرات والتحسينات المضافة</w:t>
       </w:r>
     </w:p>
     <w:p>
@@ -6864,7 +7871,150 @@
           <w:szCs w:val="22"/>
           <w:rtl/>
         </w:rPr>
-        <w:t xml:space="preserve">حقق المشروع المتطلبات الأساسية للواجب: تصميم قاعدة بيانات علائقية مترابطة، نشرها سحابياً، بناء تطبيق Flutter كامل يعمل على الموبايل والويب من نفس الكود، مع واجهة برمجية Node.js تفصل منطق البيانات عن العرض وتطبّق إجراءات تحقق وأمان أساسية (تشفير كلمات السر، رموز الجلسة، صلاحيات الأدوار). يمكن للنظام مستقبلاً أن يُوسَّع بإضافات مثل الإشعارات، أو الدفع الإلكتروني للكشفية، أو تقييم المرضى للأطباء.</w:t>
+        <w:t xml:space="preserve">بعد إنجاز المتطلبات الأساسية، أُضيفت ميزات سريرية وتحسينات لتجربة المستخدم:</w:t>
+      </w:r>
+    </w:p>
+    <w:p>
+      <w:pPr>
+        <w:bidi/>
+        <w:spacing w:after="100"/>
+        <w:jc w:val="right"/>
+      </w:pPr>
+      <w:r>
+        <w:rPr>
+          <w:rFonts w:ascii="Arial" w:cs="Arial" w:eastAsia="Arial" w:hAnsi="Arial"/>
+          <w:color w:val="000000"/>
+          <w:sz w:val="22"/>
+          <w:szCs w:val="22"/>
+          <w:rtl/>
+        </w:rPr>
+        <w:t xml:space="preserve">•  إلغاء الموعد من جهة المريض: يستطيع المريض إلغاء موعده القادم (قيد الانتظار أو المؤكَّد) مع حوار تأكيد، عبر نقطة نهاية محمية تتحقق من ملكيته للموعد.</w:t>
+      </w:r>
+    </w:p>
+    <w:p>
+      <w:pPr>
+        <w:bidi/>
+        <w:spacing w:after="100"/>
+        <w:jc w:val="right"/>
+      </w:pPr>
+      <w:r>
+        <w:rPr>
+          <w:rFonts w:ascii="Arial" w:cs="Arial" w:eastAsia="Arial" w:hAnsi="Arial"/>
+          <w:color w:val="000000"/>
+          <w:sz w:val="22"/>
+          <w:szCs w:val="22"/>
+          <w:rtl/>
+        </w:rPr>
+        <w:t xml:space="preserve">•  الحجز بخانات زمنية: بدل اختيار وقت حرّ، تُولَّد خانات ضمن دوام الطبيب (بداية/نهاية الدوام ومدة الخانة)، وتُستبعد الخانات المحجوزة والماضية تلقائياً.</w:t>
+      </w:r>
+    </w:p>
+    <w:p>
+      <w:pPr>
+        <w:bidi/>
+        <w:spacing w:after="100"/>
+        <w:jc w:val="right"/>
+      </w:pPr>
+      <w:r>
+        <w:rPr>
+          <w:rFonts w:ascii="Arial" w:cs="Arial" w:eastAsia="Arial" w:hAnsi="Arial"/>
+          <w:color w:val="000000"/>
+          <w:sz w:val="22"/>
+          <w:szCs w:val="22"/>
+          <w:rtl/>
+        </w:rPr>
+        <w:t xml:space="preserve">•  تقييم الأطباء: يقيّم المريض الطبيب من 1 إلى 5 نجوم بعد إتمام الفحص (مرة واحدة لكل موعد)، ويظهر متوسط التقييم وعدد المقيّمين على بطاقة كل طبيب.</w:t>
+      </w:r>
+    </w:p>
+    <w:p>
+      <w:pPr>
+        <w:bidi/>
+        <w:spacing w:after="100"/>
+        <w:jc w:val="right"/>
+      </w:pPr>
+      <w:r>
+        <w:rPr>
+          <w:rFonts w:ascii="Arial" w:cs="Arial" w:eastAsia="Arial" w:hAnsi="Arial"/>
+          <w:color w:val="000000"/>
+          <w:sz w:val="22"/>
+          <w:szCs w:val="22"/>
+          <w:rtl/>
+        </w:rPr>
+        <w:t xml:space="preserve">•  الوضع الليلي (Dark Mode): زر تبديل يحفظ تفضيل المستخدم محلياً عبر shared_preferences.</w:t>
+      </w:r>
+    </w:p>
+    <w:p>
+      <w:pPr>
+        <w:bidi/>
+        <w:spacing w:after="100"/>
+        <w:jc w:val="right"/>
+      </w:pPr>
+      <w:r>
+        <w:rPr>
+          <w:rFonts w:ascii="Arial" w:cs="Arial" w:eastAsia="Arial" w:hAnsi="Arial"/>
+          <w:color w:val="000000"/>
+          <w:sz w:val="22"/>
+          <w:szCs w:val="22"/>
+          <w:rtl/>
+        </w:rPr>
+        <w:t xml:space="preserve">•  تصفية الأطباء حسب التخصص، وشارات ملوّنة لحالة كل موعد، وتأكيد كلمة السر عند التسجيل.</w:t>
+      </w:r>
+    </w:p>
+    <w:p>
+      <w:pPr>
+        <w:bidi/>
+        <w:spacing w:after="160"/>
+        <w:jc w:val="right"/>
+      </w:pPr>
+      <w:r>
+        <w:rPr>
+          <w:rFonts w:ascii="Arial" w:cs="Arial" w:eastAsia="Arial" w:hAnsi="Arial"/>
+          <w:b w:val="false"/>
+          <w:bCs w:val="false"/>
+          <w:color w:val="000000"/>
+          <w:sz w:val="22"/>
+          <w:szCs w:val="22"/>
+          <w:rtl/>
+        </w:rPr>
+        <w:t xml:space="preserve">كما عولجت مشكلة انزياح التوقيت بتخزين وقت الموعد كنص محلي مباشر بحيث يتطابق الوقت المعروض مع المحجوز.</w:t>
+      </w:r>
+    </w:p>
+    <w:p>
+      <w:pPr>
+        <w:pStyle w:val="Heading1"/>
+        <w:bidi/>
+        <w:spacing w:after="160" w:before="320"/>
+        <w:jc w:val="right"/>
+      </w:pPr>
+      <w:r>
+        <w:rPr>
+          <w:rFonts w:ascii="Arial" w:cs="Arial" w:eastAsia="Arial" w:hAnsi="Arial"/>
+          <w:b/>
+          <w:bCs/>
+          <w:color w:val="000000"/>
+          <w:sz w:val="30"/>
+          <w:szCs w:val="30"/>
+          <w:rtl/>
+        </w:rPr>
+        <w:t xml:space="preserve">11. الخاتمة</w:t>
+      </w:r>
+    </w:p>
+    <w:p>
+      <w:pPr>
+        <w:bidi/>
+        <w:spacing w:after="160"/>
+        <w:jc w:val="right"/>
+      </w:pPr>
+      <w:r>
+        <w:rPr>
+          <w:rFonts w:ascii="Arial" w:cs="Arial" w:eastAsia="Arial" w:hAnsi="Arial"/>
+          <w:b w:val="false"/>
+          <w:bCs w:val="false"/>
+          <w:color w:val="000000"/>
+          <w:sz w:val="22"/>
+          <w:szCs w:val="22"/>
+          <w:rtl/>
+        </w:rPr>
+        <w:t xml:space="preserve">حقق المشروع المتطلبات الأساسية للواجب: تصميم قاعدة بيانات علائقية مترابطة، نشرها سحابياً، بناء تطبيق Flutter كامل يعمل على الموبايل والويب من نفس الكود، مع واجهة برمجية Node.js تفصل منطق البيانات عن العرض وتطبّق إجراءات تحقق وأمان أساسية (تشفير كلمات السر، رموز الجلسة، صلاحيات الأدوار)، ثم وُسِّع بميزات سريرية إضافية (الخانات الزمنية، الإلغاء، التقييم) وتحسينات لتجربة المستخدم. يمكن مستقبلاً إضافة الإشعارات أو الدفع الإلكتروني للكشفية.</w:t>
       </w:r>
     </w:p>
     <w:sectPr>

</xml_diff>